<commit_message>
Add Week 2 Practice Exercises
</commit_message>
<xml_diff>
--- a/Modules/Week3/Lecture Note.docx
+++ b/Modules/Week3/Lecture Note.docx
@@ -279,6 +279,7 @@
         <w:suppressLineNumbers w:val="0"/>
         <w:spacing w:before="0" w:beforeAutospacing="0" w:line="14" w:lineRule="atLeast"/>
         <w:ind w:left="720"/>
+        <w:jc w:val="both"/>
         <w:rPr>
           <w:rFonts w:hint="default" w:ascii="Times New Roman" w:hAnsi="Times New Roman" w:eastAsia="sans-serif" w:cs="Times New Roman"/>
         </w:rPr>
@@ -295,7 +296,15 @@
         <w:rPr>
           <w:rFonts w:hint="default" w:ascii="Times New Roman" w:hAnsi="Times New Roman" w:eastAsia="sans-serif" w:cs="Times New Roman"/>
         </w:rPr>
-        <w:t xml:space="preserve"> Product quality is the software itself. Process quality is </w:t>
+        <w:t xml:space="preserve"> </w:t>
+      </w:r>
+      <w:bookmarkStart w:id="0" w:name="_GoBack"/>
+      <w:bookmarkEnd w:id="0"/>
+      <w:r>
+        <w:rPr>
+          <w:rFonts w:hint="default" w:ascii="Times New Roman" w:hAnsi="Times New Roman" w:eastAsia="sans-serif" w:cs="Times New Roman"/>
+        </w:rPr>
+        <w:t xml:space="preserve">Product quality is the software itself. Process quality is </w:t>
       </w:r>
       <w:r>
         <w:rPr>
@@ -1757,8 +1766,6 @@
         </w:rPr>
         <w:t>When writing or reviewing an SRS (essential for your upcoming Assignment 1), your lecture slides demand that you enforce these rules:</w:t>
       </w:r>
-      <w:bookmarkStart w:id="0" w:name="_GoBack"/>
-      <w:bookmarkEnd w:id="0"/>
     </w:p>
     <w:p>
       <w:pPr>
@@ -2046,18 +2053,18 @@
     <w:lsdException w:unhideWhenUsed="0" w:uiPriority="0" w:semiHidden="0" w:name="Document Map"/>
     <w:lsdException w:unhideWhenUsed="0" w:uiPriority="0" w:semiHidden="0" w:name="Plain Text"/>
     <w:lsdException w:unhideWhenUsed="0" w:uiPriority="0" w:semiHidden="0" w:name="E-mail Signature"/>
-    <w:lsdException w:unhideWhenUsed="0" w:uiPriority="0" w:semiHidden="0" w:name="Normal (Web)"/>
+    <w:lsdException w:qFormat="1" w:unhideWhenUsed="0" w:uiPriority="0" w:semiHidden="0" w:name="Normal (Web)"/>
     <w:lsdException w:unhideWhenUsed="0" w:uiPriority="0" w:semiHidden="0" w:name="HTML Acronym"/>
     <w:lsdException w:unhideWhenUsed="0" w:uiPriority="0" w:semiHidden="0" w:name="HTML Address"/>
     <w:lsdException w:unhideWhenUsed="0" w:uiPriority="0" w:semiHidden="0" w:name="HTML Cite"/>
-    <w:lsdException w:unhideWhenUsed="0" w:uiPriority="0" w:semiHidden="0" w:name="HTML Code"/>
+    <w:lsdException w:qFormat="1" w:unhideWhenUsed="0" w:uiPriority="0" w:semiHidden="0" w:name="HTML Code"/>
     <w:lsdException w:unhideWhenUsed="0" w:uiPriority="0" w:semiHidden="0" w:name="HTML Definition"/>
     <w:lsdException w:unhideWhenUsed="0" w:uiPriority="0" w:semiHidden="0" w:name="HTML Keyboard"/>
     <w:lsdException w:unhideWhenUsed="0" w:uiPriority="0" w:semiHidden="0" w:name="HTML Preformatted"/>
     <w:lsdException w:unhideWhenUsed="0" w:uiPriority="0" w:semiHidden="0" w:name="HTML Sample"/>
     <w:lsdException w:unhideWhenUsed="0" w:uiPriority="0" w:semiHidden="0" w:name="HTML Typewriter"/>
     <w:lsdException w:unhideWhenUsed="0" w:uiPriority="0" w:semiHidden="0" w:name="HTML Variable"/>
-    <w:lsdException w:unhideWhenUsed="0" w:uiPriority="0" w:name="Normal Table"/>
+    <w:lsdException w:qFormat="1" w:unhideWhenUsed="0" w:uiPriority="0" w:name="Normal Table"/>
     <w:lsdException w:unhideWhenUsed="0" w:uiPriority="0" w:semiHidden="0" w:name="annotation subject"/>
     <w:lsdException w:unhideWhenUsed="0" w:uiPriority="0" w:semiHidden="0" w:name="Table Simple 1"/>
     <w:lsdException w:unhideWhenUsed="0" w:uiPriority="0" w:semiHidden="0" w:name="Table Simple 2"/>
@@ -2263,6 +2270,7 @@
   <w:style w:type="table" w:default="1" w:styleId="5">
     <w:name w:val="Normal Table"/>
     <w:semiHidden/>
+    <w:qFormat/>
     <w:uiPriority w:val="0"/>
     <w:tblPr>
       <w:tblCellMar>
@@ -2276,6 +2284,7 @@
   <w:style w:type="character" w:styleId="6">
     <w:name w:val="HTML Code"/>
     <w:basedOn w:val="4"/>
+    <w:qFormat/>
     <w:uiPriority w:val="0"/>
     <w:rPr>
       <w:rFonts w:ascii="Courier New" w:hAnsi="Courier New" w:cs="Courier New"/>
@@ -2285,6 +2294,7 @@
   </w:style>
   <w:style w:type="paragraph" w:styleId="7">
     <w:name w:val="Normal (Web)"/>
+    <w:qFormat/>
     <w:uiPriority w:val="0"/>
     <w:pPr>
       <w:spacing w:before="0" w:beforeAutospacing="1" w:after="0" w:afterAutospacing="1"/>
@@ -2292,6 +2302,7 @@
       <w:jc w:val="left"/>
     </w:pPr>
     <w:rPr>
+      <w:rFonts w:ascii="Times New Roman" w:hAnsi="Times New Roman" w:eastAsia="SimSun" w:cs="Times New Roman"/>
       <w:kern w:val="0"/>
       <w:sz w:val="24"/>
       <w:szCs w:val="24"/>

</xml_diff>